<commit_message>
docs: update NexusCyber Hotline number to (800) 265-6446
Co-Authored-By: Claude Opus 4.8 <noreply@anthropic.com>
</commit_message>
<xml_diff>
--- a/docs/HelpDesk_Docs/10_Carbon_ConMon_LTE_Helpdesk_Customer_Guide.docx
+++ b/docs/HelpDesk_Docs/10_Carbon_ConMon_LTE_Helpdesk_Customer_Guide.docx
@@ -2113,7 +2113,7 @@
         </w:numPr>
       </w:pPr>
       <w:r>
-        <w:t>After hours, weekends, or federal holidays: call the after-hours on-call NexusCyber Hotline — 703-457-1082 — for any P1 critical issue. The on-call engineer acknowledges within 1 hour.</w:t>
+        <w:t>After hours, weekends, or federal holidays: call the after-hours on-call NexusCyber Hotline — (800) 265-6446 — for any P1 critical issue. The on-call engineer acknowledges within 1 hour.</w:t>
       </w:r>
     </w:p>
     <w:p>
@@ -3327,7 +3327,7 @@
               <w:rPr>
                 <w:sz w:val="18"/>
               </w:rPr>
-              <w:t>NexusCyber Hotline: 703-457-1082</w:t>
+              <w:t>NexusCyber Hotline: (800) 265-6446</w:t>
             </w:r>
           </w:p>
         </w:tc>

</xml_diff>